<commit_message>
docs: add agent map to command reference
</commit_message>
<xml_diff>
--- a/WILL/share/claude-code-commands-reference-updated-2026-06-21.docx
+++ b/WILL/share/claude-code-commands-reference-updated-2026-06-21.docx
@@ -21,7 +21,7 @@
     </w:p>
     <w:p>
       <w:r>
-        <w:t>Canonical agent folders remain flat at ~/Research-workspace/AGENTS/&lt;NAME&gt;/. The grouped _CREDIT.md, _NETWORK.md, etc. files are indexes only; active agent folders were not moved.</w:t>
+        <w:t>Canonical agent folders remain flat at `~/Research-workspace/AGENTS/&lt;NAME&gt;/`. The new `_CREDIT.md`, `_NETWORK.md`, etc. files are indexes, not folders to cd into.</w:t>
       </w:r>
     </w:p>
     <w:p>
@@ -29,7 +29,7 @@
         <w:pStyle w:val="Heading1"/>
       </w:pPr>
       <w:r>
-        <w:t>SYSTEM / ORCHESTRATION</w:t>
+        <w:t>Basic Agent Map</w:t>
       </w:r>
     </w:p>
     <w:p>
@@ -37,6 +37,444 @@
         <w:pStyle w:val="Heading2"/>
       </w:pPr>
       <w:r>
+        <w:t>Path model</w:t>
+      </w:r>
+    </w:p>
+    <w:p>
+      <w:r>
+        <w:t>Agents live in flat canonical folders:</w:t>
+      </w:r>
+    </w:p>
+    <w:p>
+      <w:r>
+        <w:rPr>
+          <w:rFonts w:ascii="Consolas" w:hAnsi="Consolas"/>
+          <w:sz w:val="18"/>
+        </w:rPr>
+        <w:t>~/Research-workspace/AGENTS/&lt;NAME&gt;/</w:t>
+      </w:r>
+    </w:p>
+    <w:p>
+      <w:r>
+        <w:t>Grouped files such as `AGENTS/CREDIT.md`, `AGENTS/ENERGY.md`, and `AGENTS/NETWORK.md` are maps/indexes only. Do not `cd` into grouped subfolders; the active folders were not moved.</w:t>
+      </w:r>
+    </w:p>
+    <w:p>
+      <w:pPr>
+        <w:pStyle w:val="Heading2"/>
+      </w:pPr>
+      <w:r>
+        <w:t>Domain groups</w:t>
+      </w:r>
+    </w:p>
+    <w:p>
+      <w:r>
+        <w:t>System / orchestration</w:t>
+      </w:r>
+    </w:p>
+    <w:p>
+      <w:pPr>
+        <w:pStyle w:val="ListBullet"/>
+      </w:pPr>
+      <w:r>
+        <w:t>PROME — chief-of-staff / orchestration / final synthesis</w:t>
+      </w:r>
+    </w:p>
+    <w:p>
+      <w:pPr>
+        <w:pStyle w:val="ListBullet"/>
+      </w:pPr>
+      <w:r>
+        <w:t>WALTER — signal/news routing desk</w:t>
+      </w:r>
+    </w:p>
+    <w:p>
+      <w:pPr>
+        <w:pStyle w:val="ListBullet"/>
+      </w:pPr>
+      <w:r>
+        <w:t>NEXUS — cross-agent synthesis</w:t>
+      </w:r>
+    </w:p>
+    <w:p>
+      <w:pPr>
+        <w:pStyle w:val="ListBullet"/>
+      </w:pPr>
+      <w:r>
+        <w:t>RED — adversarial review</w:t>
+      </w:r>
+    </w:p>
+    <w:p>
+      <w:pPr>
+        <w:pStyle w:val="ListBullet"/>
+      </w:pPr>
+      <w:r>
+        <w:t>DEWEY — deep research executor</w:t>
+      </w:r>
+    </w:p>
+    <w:p>
+      <w:pPr>
+        <w:pStyle w:val="ListBullet"/>
+      </w:pPr>
+      <w:r>
+        <w:t>HERMES — signal carrier / inbox-outbox utility</w:t>
+      </w:r>
+    </w:p>
+    <w:p>
+      <w:r>
+        <w:t>Credit / consumer / banks / CRE</w:t>
+      </w:r>
+    </w:p>
+    <w:p>
+      <w:pPr>
+        <w:pStyle w:val="ListBullet"/>
+      </w:pPr>
+      <w:r>
+        <w:t>LABOR — employment / claims</w:t>
+      </w:r>
+    </w:p>
+    <w:p>
+      <w:pPr>
+        <w:pStyle w:val="ListBullet"/>
+      </w:pPr>
+      <w:r>
+        <w:t>CARL — consumer credit / housing</w:t>
+      </w:r>
+    </w:p>
+    <w:p>
+      <w:pPr>
+        <w:pStyle w:val="ListBullet"/>
+      </w:pPr>
+      <w:r>
+        <w:t>REGINALD — regional banks</w:t>
+      </w:r>
+    </w:p>
+    <w:p>
+      <w:pPr>
+        <w:pStyle w:val="ListBullet"/>
+      </w:pPr>
+      <w:r>
+        <w:t>OZK — OZK-specific bank work</w:t>
+      </w:r>
+    </w:p>
+    <w:p>
+      <w:pPr>
+        <w:pStyle w:val="ListBullet"/>
+      </w:pPr>
+      <w:r>
+        <w:t>CORAL — Florida convergence</w:t>
+      </w:r>
+    </w:p>
+    <w:p>
+      <w:pPr>
+        <w:pStyle w:val="ListBullet"/>
+      </w:pPr>
+      <w:r>
+        <w:t>CREED — national CRE / CMBS</w:t>
+      </w:r>
+    </w:p>
+    <w:p>
+      <w:pPr>
+        <w:pStyle w:val="ListBullet"/>
+      </w:pPr>
+      <w:r>
+        <w:t>OTTO — auto / consumer delinquency</w:t>
+      </w:r>
+    </w:p>
+    <w:p>
+      <w:pPr>
+        <w:pStyle w:val="ListBullet"/>
+      </w:pPr>
+      <w:r>
+        <w:t>REITS / DOC — background credit/CRE surfaces</w:t>
+      </w:r>
+    </w:p>
+    <w:p>
+      <w:r>
+        <w:t>Private credit / insurance</w:t>
+      </w:r>
+    </w:p>
+    <w:p>
+      <w:pPr>
+        <w:pStyle w:val="ListBullet"/>
+      </w:pPr>
+      <w:r>
+        <w:t>BROCK — BDCs / private credit</w:t>
+      </w:r>
+    </w:p>
+    <w:p>
+      <w:pPr>
+        <w:pStyle w:val="ListBullet"/>
+      </w:pPr>
+      <w:r>
+        <w:t>SHADE — PE-insurance-captive plumbing</w:t>
+      </w:r>
+    </w:p>
+    <w:p>
+      <w:r>
+        <w:t>Funding / macro / market structure</w:t>
+      </w:r>
+    </w:p>
+    <w:p>
+      <w:pPr>
+        <w:pStyle w:val="ListBullet"/>
+      </w:pPr>
+      <w:r>
+        <w:t>HENRY — market structure / econ data</w:t>
+      </w:r>
+    </w:p>
+    <w:p>
+      <w:pPr>
+        <w:pStyle w:val="ListBullet"/>
+      </w:pPr>
+      <w:r>
+        <w:t>LIQUID — funding / Treasury plumbing</w:t>
+      </w:r>
+    </w:p>
+    <w:p>
+      <w:pPr>
+        <w:pStyle w:val="ListBullet"/>
+      </w:pPr>
+      <w:r>
+        <w:t>BOND — bond market structure / auctions / credit spreads</w:t>
+      </w:r>
+    </w:p>
+    <w:p>
+      <w:pPr>
+        <w:pStyle w:val="ListBullet"/>
+      </w:pPr>
+      <w:r>
+        <w:t>SAM — Japan / BOJ / JGB / carry</w:t>
+      </w:r>
+    </w:p>
+    <w:p>
+      <w:pPr>
+        <w:pStyle w:val="ListBullet"/>
+      </w:pPr>
+      <w:r>
+        <w:t>ZHAO — China / capital flows</w:t>
+      </w:r>
+    </w:p>
+    <w:p>
+      <w:pPr>
+        <w:pStyle w:val="ListBullet"/>
+      </w:pPr>
+      <w:r>
+        <w:t>HANS — Europe / UST demand</w:t>
+      </w:r>
+    </w:p>
+    <w:p>
+      <w:pPr>
+        <w:pStyle w:val="ListBullet"/>
+      </w:pPr>
+      <w:r>
+        <w:t>FOREX — FX background</w:t>
+      </w:r>
+    </w:p>
+    <w:p>
+      <w:pPr>
+        <w:pStyle w:val="ListBullet"/>
+      </w:pPr>
+      <w:r>
+        <w:t>VIOLET — vol / VIX / credit-to-vol lag</w:t>
+      </w:r>
+    </w:p>
+    <w:p>
+      <w:r>
+        <w:t>Energy / geopolitics / commodities</w:t>
+      </w:r>
+    </w:p>
+    <w:p>
+      <w:pPr>
+        <w:pStyle w:val="ListBullet"/>
+      </w:pPr>
+      <w:r>
+        <w:t>HAWK — geopolitics / military</w:t>
+      </w:r>
+    </w:p>
+    <w:p>
+      <w:pPr>
+        <w:pStyle w:val="ListBullet"/>
+      </w:pPr>
+      <w:r>
+        <w:t>BRENT — oil / energy markets</w:t>
+      </w:r>
+    </w:p>
+    <w:p>
+      <w:pPr>
+        <w:pStyle w:val="ListBullet"/>
+      </w:pPr>
+      <w:r>
+        <w:t>MARCO — migration / labor flows</w:t>
+      </w:r>
+    </w:p>
+    <w:p>
+      <w:pPr>
+        <w:pStyle w:val="ListBullet"/>
+      </w:pPr>
+      <w:r>
+        <w:t>FERT — fertilizer / food security</w:t>
+      </w:r>
+    </w:p>
+    <w:p>
+      <w:pPr>
+        <w:pStyle w:val="ListBullet"/>
+      </w:pPr>
+      <w:r>
+        <w:t>CRUISE — cruise / tourism canary</w:t>
+      </w:r>
+    </w:p>
+    <w:p>
+      <w:pPr>
+        <w:pStyle w:val="ListBullet"/>
+      </w:pPr>
+      <w:r>
+        <w:t>BARON — Trump network / policy</w:t>
+      </w:r>
+    </w:p>
+    <w:p>
+      <w:r>
+        <w:t>Research / trading / ops</w:t>
+      </w:r>
+    </w:p>
+    <w:p>
+      <w:pPr>
+        <w:pStyle w:val="ListBullet"/>
+      </w:pPr>
+      <w:r>
+        <w:t>ATHENA — reading / knowledge</w:t>
+      </w:r>
+    </w:p>
+    <w:p>
+      <w:pPr>
+        <w:pStyle w:val="ListBullet"/>
+      </w:pPr>
+      <w:r>
+        <w:t>ORACLE — prediction markets</w:t>
+      </w:r>
+    </w:p>
+    <w:p>
+      <w:pPr>
+        <w:pStyle w:val="ListBullet"/>
+      </w:pPr>
+      <w:r>
+        <w:t>TERRY — trade construction desk; proposes only</w:t>
+      </w:r>
+    </w:p>
+    <w:p>
+      <w:pPr>
+        <w:pStyle w:val="ListBullet"/>
+      </w:pPr>
+      <w:r>
+        <w:t>BUFFER / EARNINGS / SENTRY / TRADES — ops, event, and trade-support surfaces</w:t>
+      </w:r>
+    </w:p>
+    <w:p>
+      <w:pPr>
+        <w:pStyle w:val="Heading2"/>
+      </w:pPr>
+      <w:r>
+        <w:t>Main transmission chains</w:t>
+      </w:r>
+    </w:p>
+    <w:p>
+      <w:r>
+        <w:rPr>
+          <w:rFonts w:ascii="Consolas" w:hAnsi="Consolas"/>
+          <w:sz w:val="18"/>
+        </w:rPr>
+        <w:t>LABOR → CARL → REGINALD → repricing</w:t>
+      </w:r>
+    </w:p>
+    <w:p>
+      <w:r>
+        <w:rPr>
+          <w:rFonts w:ascii="Consolas" w:hAnsi="Consolas"/>
+          <w:sz w:val="18"/>
+        </w:rPr>
+        <w:t>CREED → REGINALD + CORAL + LIQUID + CARL</w:t>
+      </w:r>
+    </w:p>
+    <w:p>
+      <w:r>
+        <w:rPr>
+          <w:rFonts w:ascii="Consolas" w:hAnsi="Consolas"/>
+          <w:sz w:val="18"/>
+        </w:rPr>
+        <w:t>BROCK → SHADE → LIQUID</w:t>
+      </w:r>
+    </w:p>
+    <w:p>
+      <w:r>
+        <w:rPr>
+          <w:rFonts w:ascii="Consolas" w:hAnsi="Consolas"/>
+          <w:sz w:val="18"/>
+        </w:rPr>
+        <w:t>HAWK → BRENT → HENRY / LIQUID / CARL</w:t>
+      </w:r>
+    </w:p>
+    <w:p>
+      <w:r>
+        <w:rPr>
+          <w:rFonts w:ascii="Consolas" w:hAnsi="Consolas"/>
+          <w:sz w:val="18"/>
+        </w:rPr>
+        <w:t>SAM → LIQUID</w:t>
+      </w:r>
+    </w:p>
+    <w:p>
+      <w:r>
+        <w:rPr>
+          <w:rFonts w:ascii="Consolas" w:hAnsi="Consolas"/>
+          <w:sz w:val="18"/>
+        </w:rPr>
+        <w:t>BOND → LIQUID / HENRY / REGINALD</w:t>
+      </w:r>
+    </w:p>
+    <w:p>
+      <w:r>
+        <w:rPr>
+          <w:rFonts w:ascii="Consolas" w:hAnsi="Consolas"/>
+          <w:sz w:val="18"/>
+        </w:rPr>
+        <w:t>VIOLET watches credit-to-vol lag → HENRY / LIQUID / RED</w:t>
+      </w:r>
+    </w:p>
+    <w:p>
+      <w:r>
+        <w:rPr>
+          <w:rFonts w:ascii="Consolas" w:hAnsi="Consolas"/>
+          <w:sz w:val="18"/>
+        </w:rPr>
+        <w:t>NEXUS synthesizes cross-agent convergence and contradictions</w:t>
+      </w:r>
+    </w:p>
+    <w:p>
+      <w:pPr>
+        <w:pStyle w:val="Heading2"/>
+      </w:pPr>
+      <w:r>
+        <w:t>Launch caution</w:t>
+      </w:r>
+    </w:p>
+    <w:p>
+      <w:r>
+        <w:t>This reference is a menu, not a startup script. Launch agents one at a time when possible. Too many Claude Code agents can freeze the machine or cause plugin/resource contention.</w:t>
+      </w:r>
+    </w:p>
+    <w:p>
+      <w:pPr>
+        <w:pStyle w:val="Heading1"/>
+      </w:pPr>
+      <w:r>
+        <w:t>SYSTEM / ORCHESTRATION</w:t>
+      </w:r>
+    </w:p>
+    <w:p>
+      <w:pPr>
+        <w:pStyle w:val="Heading2"/>
+      </w:pPr>
+      <w:r>
         <w:t>PROME</w:t>
       </w:r>
     </w:p>
@@ -46,9 +484,6 @@
       </w:r>
     </w:p>
     <w:p>
-      <w:pPr>
-        <w:pStyle w:val="Code"/>
-      </w:pPr>
       <w:r>
         <w:rPr>
           <w:rFonts w:ascii="Consolas" w:hAnsi="Consolas"/>
@@ -58,9 +493,6 @@
       </w:r>
     </w:p>
     <w:p>
-      <w:pPr>
-        <w:pStyle w:val="Code"/>
-      </w:pPr>
       <w:r>
         <w:rPr>
           <w:rFonts w:ascii="Consolas" w:hAnsi="Consolas"/>
@@ -83,9 +515,6 @@
       </w:r>
     </w:p>
     <w:p>
-      <w:pPr>
-        <w:pStyle w:val="Code"/>
-      </w:pPr>
       <w:r>
         <w:rPr>
           <w:rFonts w:ascii="Consolas" w:hAnsi="Consolas"/>
@@ -95,9 +524,6 @@
       </w:r>
     </w:p>
     <w:p>
-      <w:pPr>
-        <w:pStyle w:val="Code"/>
-      </w:pPr>
       <w:r>
         <w:rPr>
           <w:rFonts w:ascii="Consolas" w:hAnsi="Consolas"/>
@@ -120,9 +546,6 @@
       </w:r>
     </w:p>
     <w:p>
-      <w:pPr>
-        <w:pStyle w:val="Code"/>
-      </w:pPr>
       <w:r>
         <w:rPr>
           <w:rFonts w:ascii="Consolas" w:hAnsi="Consolas"/>
@@ -132,9 +555,6 @@
       </w:r>
     </w:p>
     <w:p>
-      <w:pPr>
-        <w:pStyle w:val="Code"/>
-      </w:pPr>
       <w:r>
         <w:rPr>
           <w:rFonts w:ascii="Consolas" w:hAnsi="Consolas"/>
@@ -157,9 +577,6 @@
       </w:r>
     </w:p>
     <w:p>
-      <w:pPr>
-        <w:pStyle w:val="Code"/>
-      </w:pPr>
       <w:r>
         <w:rPr>
           <w:rFonts w:ascii="Consolas" w:hAnsi="Consolas"/>
@@ -169,9 +586,6 @@
       </w:r>
     </w:p>
     <w:p>
-      <w:pPr>
-        <w:pStyle w:val="Code"/>
-      </w:pPr>
       <w:r>
         <w:rPr>
           <w:rFonts w:ascii="Consolas" w:hAnsi="Consolas"/>
@@ -194,9 +608,6 @@
       </w:r>
     </w:p>
     <w:p>
-      <w:pPr>
-        <w:pStyle w:val="Code"/>
-      </w:pPr>
       <w:r>
         <w:rPr>
           <w:rFonts w:ascii="Consolas" w:hAnsi="Consolas"/>
@@ -206,9 +617,6 @@
       </w:r>
     </w:p>
     <w:p>
-      <w:pPr>
-        <w:pStyle w:val="Code"/>
-      </w:pPr>
       <w:r>
         <w:rPr>
           <w:rFonts w:ascii="Consolas" w:hAnsi="Consolas"/>
@@ -231,9 +639,6 @@
       </w:r>
     </w:p>
     <w:p>
-      <w:pPr>
-        <w:pStyle w:val="Code"/>
-      </w:pPr>
       <w:r>
         <w:rPr>
           <w:rFonts w:ascii="Consolas" w:hAnsi="Consolas"/>
@@ -243,9 +648,6 @@
       </w:r>
     </w:p>
     <w:p>
-      <w:pPr>
-        <w:pStyle w:val="Code"/>
-      </w:pPr>
       <w:r>
         <w:rPr>
           <w:rFonts w:ascii="Consolas" w:hAnsi="Consolas"/>
@@ -276,9 +678,6 @@
       </w:r>
     </w:p>
     <w:p>
-      <w:pPr>
-        <w:pStyle w:val="Code"/>
-      </w:pPr>
       <w:r>
         <w:rPr>
           <w:rFonts w:ascii="Consolas" w:hAnsi="Consolas"/>
@@ -288,9 +687,6 @@
       </w:r>
     </w:p>
     <w:p>
-      <w:pPr>
-        <w:pStyle w:val="Code"/>
-      </w:pPr>
       <w:r>
         <w:rPr>
           <w:rFonts w:ascii="Consolas" w:hAnsi="Consolas"/>
@@ -313,9 +709,6 @@
       </w:r>
     </w:p>
     <w:p>
-      <w:pPr>
-        <w:pStyle w:val="Code"/>
-      </w:pPr>
       <w:r>
         <w:rPr>
           <w:rFonts w:ascii="Consolas" w:hAnsi="Consolas"/>
@@ -325,9 +718,6 @@
       </w:r>
     </w:p>
     <w:p>
-      <w:pPr>
-        <w:pStyle w:val="Code"/>
-      </w:pPr>
       <w:r>
         <w:rPr>
           <w:rFonts w:ascii="Consolas" w:hAnsi="Consolas"/>
@@ -350,9 +740,6 @@
       </w:r>
     </w:p>
     <w:p>
-      <w:pPr>
-        <w:pStyle w:val="Code"/>
-      </w:pPr>
       <w:r>
         <w:rPr>
           <w:rFonts w:ascii="Consolas" w:hAnsi="Consolas"/>
@@ -362,9 +749,6 @@
       </w:r>
     </w:p>
     <w:p>
-      <w:pPr>
-        <w:pStyle w:val="Code"/>
-      </w:pPr>
       <w:r>
         <w:rPr>
           <w:rFonts w:ascii="Consolas" w:hAnsi="Consolas"/>
@@ -387,9 +771,6 @@
       </w:r>
     </w:p>
     <w:p>
-      <w:pPr>
-        <w:pStyle w:val="Code"/>
-      </w:pPr>
       <w:r>
         <w:rPr>
           <w:rFonts w:ascii="Consolas" w:hAnsi="Consolas"/>
@@ -399,9 +780,6 @@
       </w:r>
     </w:p>
     <w:p>
-      <w:pPr>
-        <w:pStyle w:val="Code"/>
-      </w:pPr>
       <w:r>
         <w:rPr>
           <w:rFonts w:ascii="Consolas" w:hAnsi="Consolas"/>
@@ -424,9 +802,6 @@
       </w:r>
     </w:p>
     <w:p>
-      <w:pPr>
-        <w:pStyle w:val="Code"/>
-      </w:pPr>
       <w:r>
         <w:rPr>
           <w:rFonts w:ascii="Consolas" w:hAnsi="Consolas"/>
@@ -436,9 +811,6 @@
       </w:r>
     </w:p>
     <w:p>
-      <w:pPr>
-        <w:pStyle w:val="Code"/>
-      </w:pPr>
       <w:r>
         <w:rPr>
           <w:rFonts w:ascii="Consolas" w:hAnsi="Consolas"/>
@@ -461,9 +833,6 @@
       </w:r>
     </w:p>
     <w:p>
-      <w:pPr>
-        <w:pStyle w:val="Code"/>
-      </w:pPr>
       <w:r>
         <w:rPr>
           <w:rFonts w:ascii="Consolas" w:hAnsi="Consolas"/>
@@ -473,9 +842,6 @@
       </w:r>
     </w:p>
     <w:p>
-      <w:pPr>
-        <w:pStyle w:val="Code"/>
-      </w:pPr>
       <w:r>
         <w:rPr>
           <w:rFonts w:ascii="Consolas" w:hAnsi="Consolas"/>
@@ -498,9 +864,6 @@
       </w:r>
     </w:p>
     <w:p>
-      <w:pPr>
-        <w:pStyle w:val="Code"/>
-      </w:pPr>
       <w:r>
         <w:rPr>
           <w:rFonts w:ascii="Consolas" w:hAnsi="Consolas"/>
@@ -510,9 +873,6 @@
       </w:r>
     </w:p>
     <w:p>
-      <w:pPr>
-        <w:pStyle w:val="Code"/>
-      </w:pPr>
       <w:r>
         <w:rPr>
           <w:rFonts w:ascii="Consolas" w:hAnsi="Consolas"/>
@@ -535,9 +895,6 @@
       </w:r>
     </w:p>
     <w:p>
-      <w:pPr>
-        <w:pStyle w:val="Code"/>
-      </w:pPr>
       <w:r>
         <w:rPr>
           <w:rFonts w:ascii="Consolas" w:hAnsi="Consolas"/>
@@ -547,9 +904,6 @@
       </w:r>
     </w:p>
     <w:p>
-      <w:pPr>
-        <w:pStyle w:val="Code"/>
-      </w:pPr>
       <w:r>
         <w:rPr>
           <w:rFonts w:ascii="Consolas" w:hAnsi="Consolas"/>
@@ -572,9 +926,6 @@
       </w:r>
     </w:p>
     <w:p>
-      <w:pPr>
-        <w:pStyle w:val="Code"/>
-      </w:pPr>
       <w:r>
         <w:rPr>
           <w:rFonts w:ascii="Consolas" w:hAnsi="Consolas"/>
@@ -584,9 +935,6 @@
       </w:r>
     </w:p>
     <w:p>
-      <w:pPr>
-        <w:pStyle w:val="Code"/>
-      </w:pPr>
       <w:r>
         <w:rPr>
           <w:rFonts w:ascii="Consolas" w:hAnsi="Consolas"/>
@@ -617,9 +965,6 @@
       </w:r>
     </w:p>
     <w:p>
-      <w:pPr>
-        <w:pStyle w:val="Code"/>
-      </w:pPr>
       <w:r>
         <w:rPr>
           <w:rFonts w:ascii="Consolas" w:hAnsi="Consolas"/>
@@ -629,9 +974,6 @@
       </w:r>
     </w:p>
     <w:p>
-      <w:pPr>
-        <w:pStyle w:val="Code"/>
-      </w:pPr>
       <w:r>
         <w:rPr>
           <w:rFonts w:ascii="Consolas" w:hAnsi="Consolas"/>
@@ -654,9 +996,6 @@
       </w:r>
     </w:p>
     <w:p>
-      <w:pPr>
-        <w:pStyle w:val="Code"/>
-      </w:pPr>
       <w:r>
         <w:rPr>
           <w:rFonts w:ascii="Consolas" w:hAnsi="Consolas"/>
@@ -666,9 +1005,6 @@
       </w:r>
     </w:p>
     <w:p>
-      <w:pPr>
-        <w:pStyle w:val="Code"/>
-      </w:pPr>
       <w:r>
         <w:rPr>
           <w:rFonts w:ascii="Consolas" w:hAnsi="Consolas"/>
@@ -699,9 +1035,6 @@
       </w:r>
     </w:p>
     <w:p>
-      <w:pPr>
-        <w:pStyle w:val="Code"/>
-      </w:pPr>
       <w:r>
         <w:rPr>
           <w:rFonts w:ascii="Consolas" w:hAnsi="Consolas"/>
@@ -711,9 +1044,6 @@
       </w:r>
     </w:p>
     <w:p>
-      <w:pPr>
-        <w:pStyle w:val="Code"/>
-      </w:pPr>
       <w:r>
         <w:rPr>
           <w:rFonts w:ascii="Consolas" w:hAnsi="Consolas"/>
@@ -736,9 +1066,6 @@
       </w:r>
     </w:p>
     <w:p>
-      <w:pPr>
-        <w:pStyle w:val="Code"/>
-      </w:pPr>
       <w:r>
         <w:rPr>
           <w:rFonts w:ascii="Consolas" w:hAnsi="Consolas"/>
@@ -748,9 +1075,6 @@
       </w:r>
     </w:p>
     <w:p>
-      <w:pPr>
-        <w:pStyle w:val="Code"/>
-      </w:pPr>
       <w:r>
         <w:rPr>
           <w:rFonts w:ascii="Consolas" w:hAnsi="Consolas"/>
@@ -773,9 +1097,6 @@
       </w:r>
     </w:p>
     <w:p>
-      <w:pPr>
-        <w:pStyle w:val="Code"/>
-      </w:pPr>
       <w:r>
         <w:rPr>
           <w:rFonts w:ascii="Consolas" w:hAnsi="Consolas"/>
@@ -785,9 +1106,6 @@
       </w:r>
     </w:p>
     <w:p>
-      <w:pPr>
-        <w:pStyle w:val="Code"/>
-      </w:pPr>
       <w:r>
         <w:rPr>
           <w:rFonts w:ascii="Consolas" w:hAnsi="Consolas"/>
@@ -810,9 +1128,6 @@
       </w:r>
     </w:p>
     <w:p>
-      <w:pPr>
-        <w:pStyle w:val="Code"/>
-      </w:pPr>
       <w:r>
         <w:rPr>
           <w:rFonts w:ascii="Consolas" w:hAnsi="Consolas"/>
@@ -822,9 +1137,6 @@
       </w:r>
     </w:p>
     <w:p>
-      <w:pPr>
-        <w:pStyle w:val="Code"/>
-      </w:pPr>
       <w:r>
         <w:rPr>
           <w:rFonts w:ascii="Consolas" w:hAnsi="Consolas"/>
@@ -847,9 +1159,6 @@
       </w:r>
     </w:p>
     <w:p>
-      <w:pPr>
-        <w:pStyle w:val="Code"/>
-      </w:pPr>
       <w:r>
         <w:rPr>
           <w:rFonts w:ascii="Consolas" w:hAnsi="Consolas"/>
@@ -859,9 +1168,6 @@
       </w:r>
     </w:p>
     <w:p>
-      <w:pPr>
-        <w:pStyle w:val="Code"/>
-      </w:pPr>
       <w:r>
         <w:rPr>
           <w:rFonts w:ascii="Consolas" w:hAnsi="Consolas"/>
@@ -884,9 +1190,6 @@
       </w:r>
     </w:p>
     <w:p>
-      <w:pPr>
-        <w:pStyle w:val="Code"/>
-      </w:pPr>
       <w:r>
         <w:rPr>
           <w:rFonts w:ascii="Consolas" w:hAnsi="Consolas"/>
@@ -896,9 +1199,6 @@
       </w:r>
     </w:p>
     <w:p>
-      <w:pPr>
-        <w:pStyle w:val="Code"/>
-      </w:pPr>
       <w:r>
         <w:rPr>
           <w:rFonts w:ascii="Consolas" w:hAnsi="Consolas"/>
@@ -921,9 +1221,6 @@
       </w:r>
     </w:p>
     <w:p>
-      <w:pPr>
-        <w:pStyle w:val="Code"/>
-      </w:pPr>
       <w:r>
         <w:rPr>
           <w:rFonts w:ascii="Consolas" w:hAnsi="Consolas"/>
@@ -933,9 +1230,6 @@
       </w:r>
     </w:p>
     <w:p>
-      <w:pPr>
-        <w:pStyle w:val="Code"/>
-      </w:pPr>
       <w:r>
         <w:rPr>
           <w:rFonts w:ascii="Consolas" w:hAnsi="Consolas"/>
@@ -958,9 +1252,6 @@
       </w:r>
     </w:p>
     <w:p>
-      <w:pPr>
-        <w:pStyle w:val="Code"/>
-      </w:pPr>
       <w:r>
         <w:rPr>
           <w:rFonts w:ascii="Consolas" w:hAnsi="Consolas"/>
@@ -970,9 +1261,6 @@
       </w:r>
     </w:p>
     <w:p>
-      <w:pPr>
-        <w:pStyle w:val="Code"/>
-      </w:pPr>
       <w:r>
         <w:rPr>
           <w:rFonts w:ascii="Consolas" w:hAnsi="Consolas"/>
@@ -1003,9 +1291,6 @@
       </w:r>
     </w:p>
     <w:p>
-      <w:pPr>
-        <w:pStyle w:val="Code"/>
-      </w:pPr>
       <w:r>
         <w:rPr>
           <w:rFonts w:ascii="Consolas" w:hAnsi="Consolas"/>
@@ -1015,9 +1300,6 @@
       </w:r>
     </w:p>
     <w:p>
-      <w:pPr>
-        <w:pStyle w:val="Code"/>
-      </w:pPr>
       <w:r>
         <w:rPr>
           <w:rFonts w:ascii="Consolas" w:hAnsi="Consolas"/>
@@ -1040,9 +1322,6 @@
       </w:r>
     </w:p>
     <w:p>
-      <w:pPr>
-        <w:pStyle w:val="Code"/>
-      </w:pPr>
       <w:r>
         <w:rPr>
           <w:rFonts w:ascii="Consolas" w:hAnsi="Consolas"/>
@@ -1052,9 +1331,6 @@
       </w:r>
     </w:p>
     <w:p>
-      <w:pPr>
-        <w:pStyle w:val="Code"/>
-      </w:pPr>
       <w:r>
         <w:rPr>
           <w:rFonts w:ascii="Consolas" w:hAnsi="Consolas"/>
@@ -1077,9 +1353,6 @@
       </w:r>
     </w:p>
     <w:p>
-      <w:pPr>
-        <w:pStyle w:val="Code"/>
-      </w:pPr>
       <w:r>
         <w:rPr>
           <w:rFonts w:ascii="Consolas" w:hAnsi="Consolas"/>
@@ -1089,9 +1362,6 @@
       </w:r>
     </w:p>
     <w:p>
-      <w:pPr>
-        <w:pStyle w:val="Code"/>
-      </w:pPr>
       <w:r>
         <w:rPr>
           <w:rFonts w:ascii="Consolas" w:hAnsi="Consolas"/>
@@ -1114,9 +1384,6 @@
       </w:r>
     </w:p>
     <w:p>
-      <w:pPr>
-        <w:pStyle w:val="Code"/>
-      </w:pPr>
       <w:r>
         <w:rPr>
           <w:rFonts w:ascii="Consolas" w:hAnsi="Consolas"/>
@@ -1126,9 +1393,6 @@
       </w:r>
     </w:p>
     <w:p>
-      <w:pPr>
-        <w:pStyle w:val="Code"/>
-      </w:pPr>
       <w:r>
         <w:rPr>
           <w:rFonts w:ascii="Consolas" w:hAnsi="Consolas"/>
@@ -1151,9 +1415,6 @@
       </w:r>
     </w:p>
     <w:p>
-      <w:pPr>
-        <w:pStyle w:val="Code"/>
-      </w:pPr>
       <w:r>
         <w:rPr>
           <w:rFonts w:ascii="Consolas" w:hAnsi="Consolas"/>
@@ -1163,9 +1424,6 @@
       </w:r>
     </w:p>
     <w:p>
-      <w:pPr>
-        <w:pStyle w:val="Code"/>
-      </w:pPr>
       <w:r>
         <w:rPr>
           <w:rFonts w:ascii="Consolas" w:hAnsi="Consolas"/>
@@ -1188,9 +1446,6 @@
       </w:r>
     </w:p>
     <w:p>
-      <w:pPr>
-        <w:pStyle w:val="Code"/>
-      </w:pPr>
       <w:r>
         <w:rPr>
           <w:rFonts w:ascii="Consolas" w:hAnsi="Consolas"/>
@@ -1200,9 +1455,6 @@
       </w:r>
     </w:p>
     <w:p>
-      <w:pPr>
-        <w:pStyle w:val="Code"/>
-      </w:pPr>
       <w:r>
         <w:rPr>
           <w:rFonts w:ascii="Consolas" w:hAnsi="Consolas"/>
@@ -1233,9 +1485,6 @@
       </w:r>
     </w:p>
     <w:p>
-      <w:pPr>
-        <w:pStyle w:val="Code"/>
-      </w:pPr>
       <w:r>
         <w:rPr>
           <w:rFonts w:ascii="Consolas" w:hAnsi="Consolas"/>
@@ -1245,9 +1494,6 @@
       </w:r>
     </w:p>
     <w:p>
-      <w:pPr>
-        <w:pStyle w:val="Code"/>
-      </w:pPr>
       <w:r>
         <w:rPr>
           <w:rFonts w:ascii="Consolas" w:hAnsi="Consolas"/>
@@ -1270,9 +1516,6 @@
       </w:r>
     </w:p>
     <w:p>
-      <w:pPr>
-        <w:pStyle w:val="Code"/>
-      </w:pPr>
       <w:r>
         <w:rPr>
           <w:rFonts w:ascii="Consolas" w:hAnsi="Consolas"/>
@@ -1282,9 +1525,6 @@
       </w:r>
     </w:p>
     <w:p>
-      <w:pPr>
-        <w:pStyle w:val="Code"/>
-      </w:pPr>
       <w:r>
         <w:rPr>
           <w:rFonts w:ascii="Consolas" w:hAnsi="Consolas"/>
@@ -1307,9 +1547,6 @@
       </w:r>
     </w:p>
     <w:p>
-      <w:pPr>
-        <w:pStyle w:val="Code"/>
-      </w:pPr>
       <w:r>
         <w:rPr>
           <w:rFonts w:ascii="Consolas" w:hAnsi="Consolas"/>
@@ -1319,9 +1556,6 @@
       </w:r>
     </w:p>
     <w:p>
-      <w:pPr>
-        <w:pStyle w:val="Code"/>
-      </w:pPr>
       <w:r>
         <w:rPr>
           <w:rFonts w:ascii="Consolas" w:hAnsi="Consolas"/>
@@ -1344,9 +1578,6 @@
       </w:r>
     </w:p>
     <w:p>
-      <w:pPr>
-        <w:pStyle w:val="Code"/>
-      </w:pPr>
       <w:r>
         <w:rPr>
           <w:rFonts w:ascii="Consolas" w:hAnsi="Consolas"/>
@@ -1356,9 +1587,6 @@
       </w:r>
     </w:p>
     <w:p>
-      <w:pPr>
-        <w:pStyle w:val="Code"/>
-      </w:pPr>
       <w:r>
         <w:rPr>
           <w:rFonts w:ascii="Consolas" w:hAnsi="Consolas"/>
@@ -1381,9 +1609,6 @@
       </w:r>
     </w:p>
     <w:p>
-      <w:pPr>
-        <w:pStyle w:val="Code"/>
-      </w:pPr>
       <w:r>
         <w:rPr>
           <w:rFonts w:ascii="Consolas" w:hAnsi="Consolas"/>
@@ -1393,9 +1618,6 @@
       </w:r>
     </w:p>
     <w:p>
-      <w:pPr>
-        <w:pStyle w:val="Code"/>
-      </w:pPr>
       <w:r>
         <w:rPr>
           <w:rFonts w:ascii="Consolas" w:hAnsi="Consolas"/>
@@ -1418,9 +1640,6 @@
       </w:r>
     </w:p>
     <w:p>
-      <w:pPr>
-        <w:pStyle w:val="Code"/>
-      </w:pPr>
       <w:r>
         <w:rPr>
           <w:rFonts w:ascii="Consolas" w:hAnsi="Consolas"/>
@@ -1430,9 +1649,6 @@
       </w:r>
     </w:p>
     <w:p>
-      <w:pPr>
-        <w:pStyle w:val="Code"/>
-      </w:pPr>
       <w:r>
         <w:rPr>
           <w:rFonts w:ascii="Consolas" w:hAnsi="Consolas"/>
@@ -1455,9 +1671,6 @@
       </w:r>
     </w:p>
     <w:p>
-      <w:pPr>
-        <w:pStyle w:val="Code"/>
-      </w:pPr>
       <w:r>
         <w:rPr>
           <w:rFonts w:ascii="Consolas" w:hAnsi="Consolas"/>
@@ -1467,9 +1680,6 @@
       </w:r>
     </w:p>
     <w:p>
-      <w:pPr>
-        <w:pStyle w:val="Code"/>
-      </w:pPr>
       <w:r>
         <w:rPr>
           <w:rFonts w:ascii="Consolas" w:hAnsi="Consolas"/>
@@ -1489,49 +1699,70 @@
     <w:p>
       <w:r>
         <w:t>Detach without killing the session:</w:t>
-        <w:br/>
+      </w:r>
+    </w:p>
+    <w:p>
+      <w:r>
         <w:t>Ctrl+B  then  D</w:t>
       </w:r>
     </w:p>
     <w:p>
       <w:r>
         <w:t>List all tmux sessions:</w:t>
-        <w:br/>
+      </w:r>
+    </w:p>
+    <w:p>
+      <w:r>
         <w:t>tmux ls</w:t>
       </w:r>
     </w:p>
     <w:p>
       <w:r>
         <w:t>Attach to a session:</w:t>
-        <w:br/>
+      </w:r>
+    </w:p>
+    <w:p>
+      <w:r>
         <w:t>tmux attach -t &lt;name&gt;</w:t>
       </w:r>
     </w:p>
     <w:p>
       <w:r>
         <w:t>Kill one agent:</w:t>
-        <w:br/>
+      </w:r>
+    </w:p>
+    <w:p>
+      <w:r>
         <w:t>tmux kill-session -t &lt;name&gt;</w:t>
       </w:r>
     </w:p>
     <w:p>
       <w:r>
         <w:t>Kill all tmux sessions at once (nuclear option):</w:t>
-        <w:br/>
+      </w:r>
+    </w:p>
+    <w:p>
+      <w:r>
         <w:t>tmux kill-server</w:t>
       </w:r>
     </w:p>
     <w:p>
       <w:r>
         <w:t>Kill zombie Telegram processes from uncleanly-shutdown agents (do NOT run while agents are active):</w:t>
-        <w:br/>
+      </w:r>
+    </w:p>
+    <w:p>
+      <w:r>
         <w:t>pkill -f "bun.*server.ts"</w:t>
       </w:r>
     </w:p>
     <w:p>
       <w:r>
         <w:t>Check for zombie bun processes before running that:</w:t>
-        <w:br/>
+      </w:r>
+    </w:p>
+    <w:p>
+      <w:r>
         <w:t>ps aux | grep "bun.*server.ts"</w:t>
       </w:r>
     </w:p>
@@ -1546,13 +1777,16 @@
     <w:p>
       <w:r>
         <w:t>Canonical agent paths remain flat even though grouped index files now exist:</w:t>
-        <w:br/>
+      </w:r>
+    </w:p>
+    <w:p>
+      <w:r>
         <w:t>~/Research-workspace/AGENTS/&lt;NAME&gt;/</w:t>
       </w:r>
     </w:p>
     <w:p>
       <w:r>
-        <w:t>Grouped files such as AGENTS/_CREDIT.md and AGENTS/_NETWORK.md are navigation/index files only. Do not cd into grouped subfolders; active agent folders were not moved.</w:t>
+        <w:t>Grouped files such as AGENTS/CREDIT.md and AGENTS/NETWORK.md are navigation/index files only. Do not cd into grouped subfolders; active agent folders were not moved.</w:t>
       </w:r>
     </w:p>
     <w:p>
@@ -1581,20 +1815,39 @@
     <w:p>
       <w:r>
         <w:t>Check current DNS:</w:t>
-        <w:br/>
+      </w:r>
+    </w:p>
+    <w:p>
+      <w:r>
         <w:t>cat /etc/resolv.conf</w:t>
-        <w:br/>
-        <w:t># Should show: nameserver 8.8.8.8</w:t>
+      </w:r>
+    </w:p>
+    <w:p>
+      <w:pPr>
+        <w:pStyle w:val="Title"/>
+        <w:jc w:val="center"/>
+      </w:pPr>
+      <w:r>
+        <w:t>Should show: nameserver 8.8.8.8</w:t>
       </w:r>
     </w:p>
     <w:p>
       <w:r>
         <w:t>Unlock and reset (only if DNS is broken):</w:t>
-        <w:br/>
+      </w:r>
+    </w:p>
+    <w:p>
+      <w:r>
         <w:t>sudo chattr -i /etc/resolv.conf</w:t>
-        <w:br/>
+      </w:r>
+    </w:p>
+    <w:p>
+      <w:r>
         <w:t>sudo sh -c 'echo "nameserver 8.8.8.8" &gt; /etc/resolv.conf'</w:t>
-        <w:br/>
+      </w:r>
+    </w:p>
+    <w:p>
+      <w:r>
         <w:t>sudo chattr +i /etc/resolv.conf</w:t>
       </w:r>
     </w:p>
@@ -1607,74 +1860,32 @@
       </w:r>
     </w:p>
     <w:p>
-      <w:pPr>
-        <w:pStyle w:val="Code"/>
-      </w:pPr>
-      <w:r>
-        <w:rPr>
-          <w:rFonts w:ascii="Consolas" w:hAnsi="Consolas"/>
-          <w:sz w:val="18"/>
-        </w:rPr>
+      <w:r>
         <w:t>ssh moltbot@100.86.70.6</w:t>
       </w:r>
     </w:p>
     <w:p>
-      <w:pPr>
-        <w:pStyle w:val="Code"/>
-      </w:pPr>
-      <w:r>
-        <w:rPr>
-          <w:rFonts w:ascii="Consolas" w:hAnsi="Consolas"/>
-          <w:sz w:val="18"/>
-        </w:rPr>
+      <w:r>
         <w:t>systemctl --user restart openclaw-gateway</w:t>
       </w:r>
     </w:p>
     <w:p>
-      <w:pPr>
-        <w:pStyle w:val="Code"/>
-      </w:pPr>
-      <w:r>
-        <w:rPr>
-          <w:rFonts w:ascii="Consolas" w:hAnsi="Consolas"/>
-          <w:sz w:val="18"/>
-        </w:rPr>
+      <w:r>
         <w:t>systemctl --user status openclaw-gateway</w:t>
       </w:r>
     </w:p>
     <w:p>
-      <w:pPr>
-        <w:pStyle w:val="Code"/>
-      </w:pPr>
-      <w:r>
-        <w:rPr>
-          <w:rFonts w:ascii="Consolas" w:hAnsi="Consolas"/>
-          <w:sz w:val="18"/>
-        </w:rPr>
+      <w:r>
         <w:t>openclaw gateway status</w:t>
       </w:r>
     </w:p>
     <w:p>
-      <w:pPr>
-        <w:pStyle w:val="Code"/>
-      </w:pPr>
-      <w:r>
-        <w:rPr>
-          <w:rFonts w:ascii="Consolas" w:hAnsi="Consolas"/>
-          <w:sz w:val="18"/>
-        </w:rPr>
+      <w:r>
         <w:t>tail -50 /tmp/openclaw/openclaw-$(date +%Y-%m-%d).log</w:t>
       </w:r>
     </w:p>
     <w:p>
-      <w:pPr>
-        <w:pStyle w:val="Code"/>
-      </w:pPr>
-      <w:r>
-        <w:rPr>
-          <w:rFonts w:ascii="Consolas" w:hAnsi="Consolas"/>
-          <w:sz w:val="18"/>
-        </w:rPr>
+      <w:r>
         <w:t>openclaw cron list</w:t>
       </w:r>
     </w:p>
@@ -1689,17 +1900,35 @@
     <w:p>
       <w:r>
         <w:t>Agent won't boot: probably resource contention. Wait, then try one at a time.</w:t>
-        <w:br/>
+      </w:r>
+    </w:p>
+    <w:p>
+      <w:r>
         <w:t>"Unable to connect to API": check DNS with cat /etc/resolv.conf.</w:t>
-        <w:br/>
+      </w:r>
+    </w:p>
+    <w:p>
+      <w:r>
         <w:t>Agent frozen / can't scroll: Ctrl+B then [ to scroll, q to exit. Or mouse scroll.</w:t>
-        <w:br/>
+      </w:r>
+    </w:p>
+    <w:p>
+      <w:r>
         <w:t>tmux session stuck: tmux kill-session -t &lt;name&gt; and relaunch.</w:t>
-        <w:br/>
+      </w:r>
+    </w:p>
+    <w:p>
+      <w:r>
         <w:t>Zombie bun processes: pkill -f "bun.*server.ts" only when no agents are running.</w:t>
-        <w:br/>
+      </w:r>
+    </w:p>
+    <w:p>
+      <w:r>
         <w:t>Computer freezing: too many agents. Kill idle ones with tmux kill-session -t &lt;name&gt;.</w:t>
-        <w:br/>
+      </w:r>
+    </w:p>
+    <w:p>
+      <w:r>
         <w:t>Telegram plugin dropping messages: known bug. WALTER should be the only Claude Code agent using Telegram.</w:t>
       </w:r>
     </w:p>
@@ -1714,13 +1943,25 @@
     <w:p>
       <w:r>
         <w:t>Agent working dirs: ~/Research-workspace/AGENTS/&lt;NAME&gt;/</w:t>
-        <w:br/>
+      </w:r>
+    </w:p>
+    <w:p>
+      <w:r>
         <w:t>Telegram bot tokens: ~/.claude/channels/telegram-&lt;name&gt;/.env</w:t>
-        <w:br/>
+      </w:r>
+    </w:p>
+    <w:p>
+      <w:r>
         <w:t>Tmux config: ~/.tmux.conf</w:t>
-        <w:br/>
+      </w:r>
+    </w:p>
+    <w:p>
+      <w:r>
         <w:t>Start script (not currently used): ~/start-agents.sh</w:t>
-        <w:br/>
+      </w:r>
+    </w:p>
+    <w:p>
+      <w:r>
         <w:t>Claude Code global settings: ~/.claude/settings.json</w:t>
       </w:r>
     </w:p>
@@ -1735,55 +1976,109 @@
     <w:p>
       <w:r>
         <w:t>Start:</w:t>
-        <w:br/>
+      </w:r>
+    </w:p>
+    <w:p>
+      <w:r>
         <w:t>cd ~/career-launch</w:t>
-        <w:br/>
+      </w:r>
+    </w:p>
+    <w:p>
+      <w:r>
         <w:t>git pull</w:t>
-        <w:br/>
+      </w:r>
+    </w:p>
+    <w:p>
+      <w:r>
         <w:t>claude</w:t>
-        <w:br/>
+      </w:r>
+    </w:p>
+    <w:p>
+      <w:r>
         <w:t>Tell Claude: "Read HANDOFF.md — continuing the career project."</w:t>
       </w:r>
     </w:p>
     <w:p>
       <w:r>
         <w:t>Check:</w:t>
-        <w:br/>
+      </w:r>
+    </w:p>
+    <w:p>
+      <w:r>
         <w:t>git status</w:t>
-        <w:br/>
+      </w:r>
+    </w:p>
+    <w:p>
+      <w:r>
         <w:t>git log --oneline -5</w:t>
-        <w:br/>
+      </w:r>
+    </w:p>
+    <w:p>
+      <w:r>
         <w:t>ls -la</w:t>
       </w:r>
     </w:p>
     <w:p>
       <w:r>
         <w:t>Save:</w:t>
-        <w:br/>
+      </w:r>
+    </w:p>
+    <w:p>
+      <w:r>
         <w:t>git add .</w:t>
-        <w:br/>
+      </w:r>
+    </w:p>
+    <w:p>
+      <w:r>
         <w:t>git commit -m "short description of what changed"</w:t>
-        <w:br/>
+      </w:r>
+    </w:p>
+    <w:p>
+      <w:r>
         <w:t>git push</w:t>
       </w:r>
     </w:p>
     <w:p>
       <w:r>
         <w:t>Gotchas:</w:t>
-        <w:br/>
-        <w:t>- Run git commands from inside ~/career-launch.</w:t>
-        <w:br/>
-        <w:t>- Run commands one at a time if terminal is flaky.</w:t>
-        <w:br/>
-        <w:t>- Never commit/publish the _private/ folder.</w:t>
+      </w:r>
+    </w:p>
+    <w:p>
+      <w:pPr>
+        <w:pStyle w:val="ListBullet"/>
+      </w:pPr>
+      <w:r>
+        <w:t>Run git commands from inside ~/career-launch.</w:t>
+      </w:r>
+    </w:p>
+    <w:p>
+      <w:pPr>
+        <w:pStyle w:val="ListBullet"/>
+      </w:pPr>
+      <w:r>
+        <w:t>Run commands one at a time if terminal is flaky.</w:t>
+      </w:r>
+    </w:p>
+    <w:p>
+      <w:pPr>
+        <w:pStyle w:val="ListBullet"/>
+      </w:pPr>
+      <w:r>
+        <w:t>Never commit/publish the _private/ folder.</w:t>
       </w:r>
     </w:p>
     <w:p>
       <w:r>
         <w:t>Repo:</w:t>
-        <w:br/>
+      </w:r>
+    </w:p>
+    <w:p>
+      <w:r>
         <w:t>GitHub: https://github.com/williepowen-debug/career-launch</w:t>
-        <w:br/>
+      </w:r>
+    </w:p>
+    <w:p>
+      <w:r>
         <w:t>Local: ~/career-launch</w:t>
       </w:r>
     </w:p>
@@ -13846,13 +14141,6 @@
         <w:shd w:val="clear" w:color="auto" w:fill="FBCAA2" w:themeFill="accent6" w:themeFillTint="7F"/>
       </w:tcPr>
     </w:tblStylePr>
-  </w:style>
-  <w:style w:type="paragraph" w:customStyle="1" w:styleId="Code">
-    <w:name w:val="Code"/>
-    <w:rPr>
-      <w:rFonts w:ascii="Consolas" w:hAnsi="Consolas"/>
-      <w:sz w:val="18"/>
-    </w:rPr>
   </w:style>
 </w:styles>
 </file>

</xml_diff>

<commit_message>
CREED: absorb REIT equity tape
</commit_message>
<xml_diff>
--- a/WILL/share/claude-code-commands-reference-updated-2026-06-21.docx
+++ b/WILL/share/claude-code-commands-reference-updated-2026-06-21.docx
@@ -170,7 +170,7 @@
         <w:pStyle w:val="ListBullet"/>
       </w:pPr>
       <w:r>
-        <w:t>CREED — national CRE / CMBS</w:t>
+        <w:t>CREED — national CRE / CMBS + public REIT equity tape</w:t>
       </w:r>
     </w:p>
     <w:p>
@@ -186,7 +186,15 @@
         <w:pStyle w:val="ListBullet"/>
       </w:pPr>
       <w:r>
-        <w:t>REITS / DOC — background credit/CRE surfaces</w:t>
+        <w:t>DOC — background credit/CRE surface</w:t>
+      </w:r>
+    </w:p>
+    <w:p>
+      <w:pPr>
+        <w:pStyle w:val="ListBullet"/>
+      </w:pPr>
+      <w:r>
+        <w:t>REITS — archived/dormant; public REIT tape now lives in CREED</w:t>
       </w:r>
     </w:p>
     <w:p>
@@ -879,37 +887,6 @@
           <w:sz w:val="18"/>
         </w:rPr>
         <w:t>tmux attach -t otto</w:t>
-      </w:r>
-    </w:p>
-    <w:p>
-      <w:pPr>
-        <w:pStyle w:val="Heading2"/>
-      </w:pPr>
-      <w:r>
-        <w:t>REITS</w:t>
-      </w:r>
-    </w:p>
-    <w:p>
-      <w:r>
-        <w:t>REIT/CRE background.</w:t>
-      </w:r>
-    </w:p>
-    <w:p>
-      <w:r>
-        <w:rPr>
-          <w:rFonts w:ascii="Consolas" w:hAnsi="Consolas"/>
-          <w:sz w:val="18"/>
-        </w:rPr>
-        <w:t>tmux new -s reits -d 'cd ~/Research-workspace/AGENTS/REITS &amp;&amp; claude --dangerously-skip-permissions'</w:t>
-      </w:r>
-    </w:p>
-    <w:p>
-      <w:r>
-        <w:rPr>
-          <w:rFonts w:ascii="Consolas" w:hAnsi="Consolas"/>
-          <w:sz w:val="18"/>
-        </w:rPr>
-        <w:t>tmux attach -t reits</w:t>
       </w:r>
     </w:p>
     <w:p>

</xml_diff>

<commit_message>
TERRY: archive legacy TRADES playbook
</commit_message>
<xml_diff>
--- a/WILL/share/claude-code-commands-reference-updated-2026-06-21.docx
+++ b/WILL/share/claude-code-commands-reference-updated-2026-06-21.docx
@@ -374,7 +374,15 @@
         <w:pStyle w:val="ListBullet"/>
       </w:pPr>
       <w:r>
-        <w:t>BUFFER / EARNINGS / SENTRY / TRADES — ops, event, and trade-support surfaces</w:t>
+        <w:t>TRADES — archived/dormant; old candidate scratchpad now lives in TERRY archive</w:t>
+      </w:r>
+    </w:p>
+    <w:p>
+      <w:pPr>
+        <w:pStyle w:val="ListBullet"/>
+      </w:pPr>
+      <w:r>
+        <w:t>BUFFER / EARNINGS / SENTRY — ops, event, and trade-support surfaces</w:t>
       </w:r>
     </w:p>
     <w:p>
@@ -1632,37 +1640,6 @@
           <w:sz w:val="18"/>
         </w:rPr>
         <w:t>tmux attach -t sentry</w:t>
-      </w:r>
-    </w:p>
-    <w:p>
-      <w:pPr>
-        <w:pStyle w:val="Heading2"/>
-      </w:pPr>
-      <w:r>
-        <w:t>TRADES</w:t>
-      </w:r>
-    </w:p>
-    <w:p>
-      <w:r>
-        <w:t>Trade artifacts surface.</w:t>
-      </w:r>
-    </w:p>
-    <w:p>
-      <w:r>
-        <w:rPr>
-          <w:rFonts w:ascii="Consolas" w:hAnsi="Consolas"/>
-          <w:sz w:val="18"/>
-        </w:rPr>
-        <w:t>tmux new -s trades -d 'cd ~/Research-workspace/AGENTS/TRADES &amp;&amp; claude --dangerously-skip-permissions'</w:t>
-      </w:r>
-    </w:p>
-    <w:p>
-      <w:r>
-        <w:rPr>
-          <w:rFonts w:ascii="Consolas" w:hAnsi="Consolas"/>
-          <w:sz w:val="18"/>
-        </w:rPr>
-        <w:t>tmux attach -t trades</w:t>
       </w:r>
     </w:p>
     <w:p>

</xml_diff>